<commit_message>
Atualiza documento de arquitetura
</commit_message>
<xml_diff>
--- a/docs/Documento_Arquitetura_CONVIVA.docx
+++ b/docs/Documento_Arquitetura_CONVIVA.docx
@@ -113,15 +113,7 @@
         <w:t>persistência</w:t>
       </w:r>
       <w:r>
-        <w:t xml:space="preserve"> local usa </w:t>
-      </w:r>
-      <w:proofErr w:type="spellStart"/>
-      <w:r>
-        <w:t>SQLite</w:t>
-      </w:r>
-      <w:proofErr w:type="spellEnd"/>
-      <w:r>
-        <w:t>.</w:t>
+        <w:t xml:space="preserve"> local usa SQLite.</w:t>
       </w:r>
     </w:p>
     <w:tbl>
@@ -194,11 +186,9 @@
             </w:tcMar>
           </w:tcPr>
           <w:p>
-            <w:proofErr w:type="spellStart"/>
             <w:r>
               <w:t>View</w:t>
             </w:r>
-            <w:proofErr w:type="spellEnd"/>
           </w:p>
         </w:tc>
         <w:tc>
@@ -212,21 +202,8 @@
             </w:tcMar>
           </w:tcPr>
           <w:p>
-            <w:proofErr w:type="spellStart"/>
-            <w:r>
-              <w:t>Templates</w:t>
-            </w:r>
-            <w:proofErr w:type="spellEnd"/>
-            <w:r>
-              <w:t xml:space="preserve"> HTML, CSS e </w:t>
-            </w:r>
-            <w:proofErr w:type="spellStart"/>
-            <w:r>
-              <w:t>JavaScript</w:t>
-            </w:r>
-            <w:proofErr w:type="spellEnd"/>
-            <w:r>
-              <w:t xml:space="preserve"> da tela de </w:t>
+            <w:r>
+              <w:t xml:space="preserve">Templates HTML, CSS e JavaScript da tela de </w:t>
             </w:r>
             <w:r>
               <w:t>reunião</w:t>
@@ -249,11 +226,9 @@
             </w:tcMar>
           </w:tcPr>
           <w:p>
-            <w:proofErr w:type="spellStart"/>
             <w:r>
               <w:t>Controller</w:t>
             </w:r>
-            <w:proofErr w:type="spellEnd"/>
           </w:p>
         </w:tc>
         <w:tc>
@@ -362,13 +337,8 @@
           </w:tcPr>
           <w:p>
             <w:r>
-              <w:t>Model/</w:t>
-            </w:r>
-            <w:proofErr w:type="spellStart"/>
-            <w:r>
-              <w:t>Repository</w:t>
-            </w:r>
-            <w:proofErr w:type="spellEnd"/>
+              <w:t>Model/Repository</w:t>
+            </w:r>
           </w:p>
         </w:tc>
         <w:tc>
@@ -416,13 +386,8 @@
             </w:tcMar>
           </w:tcPr>
           <w:p>
-            <w:proofErr w:type="spellStart"/>
-            <w:r>
-              <w:t>SQLite</w:t>
-            </w:r>
-            <w:proofErr w:type="spellEnd"/>
-            <w:r>
-              <w:t xml:space="preserve"> local para </w:t>
+            <w:r>
+              <w:t xml:space="preserve">SQLite local para </w:t>
             </w:r>
             <w:r>
               <w:t>demonstração</w:t>
@@ -451,7 +416,13 @@
         <w:t>Visão</w:t>
       </w:r>
       <w:r>
-        <w:t xml:space="preserve"> Logica</w:t>
+        <w:t xml:space="preserve"> L</w:t>
+      </w:r>
+      <w:r>
+        <w:t>ó</w:t>
+      </w:r>
+      <w:r>
+        <w:t>gica</w:t>
       </w:r>
     </w:p>
     <w:p>
@@ -462,67 +433,19 @@
         <w:t>são</w:t>
       </w:r>
       <w:r>
-        <w:t xml:space="preserve"> </w:t>
-      </w:r>
-      <w:proofErr w:type="spellStart"/>
-      <w:r>
-        <w:t>Usuario</w:t>
-      </w:r>
-      <w:proofErr w:type="spellEnd"/>
-      <w:r>
-        <w:t xml:space="preserve">, </w:t>
-      </w:r>
-      <w:proofErr w:type="spellStart"/>
-      <w:r>
-        <w:t>Reuniao</w:t>
-      </w:r>
-      <w:proofErr w:type="spellEnd"/>
-      <w:r>
-        <w:t xml:space="preserve">, </w:t>
-      </w:r>
-      <w:proofErr w:type="spellStart"/>
-      <w:r>
-        <w:t>ConvidadoReuniao</w:t>
-      </w:r>
-      <w:proofErr w:type="spellEnd"/>
-      <w:r>
-        <w:t xml:space="preserve">, Pauta, </w:t>
+        <w:t xml:space="preserve"> Usuario, Reuniao, ConvidadoReuniao, Pauta, </w:t>
       </w:r>
       <w:r>
         <w:t>Votação</w:t>
       </w:r>
       <w:r>
-        <w:t xml:space="preserve">, </w:t>
-      </w:r>
-      <w:proofErr w:type="spellStart"/>
-      <w:r>
-        <w:t>OpcaoVoto</w:t>
-      </w:r>
-      <w:proofErr w:type="spellEnd"/>
-      <w:r>
-        <w:t xml:space="preserve">, Voto, Lote, </w:t>
+        <w:t xml:space="preserve">, OpcaoVoto, Voto, Lote, </w:t>
       </w:r>
       <w:r>
         <w:t>Procuração</w:t>
       </w:r>
       <w:r>
-        <w:t xml:space="preserve"> e </w:t>
-      </w:r>
-      <w:proofErr w:type="spellStart"/>
-      <w:r>
-        <w:t>LogAuditoria</w:t>
-      </w:r>
-      <w:proofErr w:type="spellEnd"/>
-      <w:r>
-        <w:t xml:space="preserve">. Os </w:t>
-      </w:r>
-      <w:proofErr w:type="spellStart"/>
-      <w:r>
-        <w:t>services</w:t>
-      </w:r>
-      <w:proofErr w:type="spellEnd"/>
-      <w:r>
-        <w:t xml:space="preserve"> orquestram essas entidades sem expor SQL para a camada de interface.</w:t>
+        <w:t xml:space="preserve"> e LogAuditoria. Os services orquestram essas entidades sem expor SQL para a camada de interface.</w:t>
       </w:r>
     </w:p>
     <w:p>
@@ -669,15 +592,7 @@
           </w:tcPr>
           <w:p>
             <w:r>
-              <w:t xml:space="preserve">Controladores MVC e </w:t>
-            </w:r>
-            <w:proofErr w:type="spellStart"/>
-            <w:r>
-              <w:t>endpoints</w:t>
-            </w:r>
-            <w:proofErr w:type="spellEnd"/>
-            <w:r>
-              <w:t xml:space="preserve"> JSON.</w:t>
+              <w:t>Controladores MVC e endpoints JSON.</w:t>
             </w:r>
           </w:p>
         </w:tc>
@@ -791,13 +706,8 @@
             </w:tcMar>
           </w:tcPr>
           <w:p>
-            <w:proofErr w:type="spellStart"/>
-            <w:r>
-              <w:t>Views</w:t>
-            </w:r>
-            <w:proofErr w:type="spellEnd"/>
-            <w:r>
-              <w:t xml:space="preserve"> HTML.</w:t>
+            <w:r>
+              <w:t>Views HTML.</w:t>
             </w:r>
           </w:p>
         </w:tc>
@@ -830,13 +740,8 @@
             </w:tcMar>
           </w:tcPr>
           <w:p>
-            <w:proofErr w:type="spellStart"/>
-            <w:r>
-              <w:t>Hash</w:t>
-            </w:r>
-            <w:proofErr w:type="spellEnd"/>
-            <w:r>
-              <w:t xml:space="preserve"> de senha, token assinado e cookie de </w:t>
+            <w:r>
+              <w:t xml:space="preserve">Hash de senha, token assinado e cookie de </w:t>
             </w:r>
             <w:r>
               <w:t>sessão</w:t>
@@ -940,40 +845,16 @@
         <w:t>O sistema usa PBKDF2</w:t>
       </w:r>
       <w:r>
-        <w:t xml:space="preserve"> (</w:t>
-      </w:r>
-      <w:proofErr w:type="spellStart"/>
-      <w:r>
-        <w:t>Password</w:t>
+        <w:t xml:space="preserve"> (Password</w:t>
       </w:r>
       <w:r>
         <w:t>-</w:t>
       </w:r>
       <w:r>
-        <w:t>Based</w:t>
-      </w:r>
-      <w:proofErr w:type="spellEnd"/>
-      <w:r>
-        <w:t xml:space="preserve"> </w:t>
-      </w:r>
-      <w:r>
-        <w:t xml:space="preserve">Key </w:t>
-      </w:r>
-      <w:proofErr w:type="spellStart"/>
-      <w:r>
-        <w:t>Derivation</w:t>
-      </w:r>
-      <w:proofErr w:type="spellEnd"/>
-      <w:r>
-        <w:t xml:space="preserve"> </w:t>
-      </w:r>
-      <w:proofErr w:type="spellStart"/>
-      <w:r>
-        <w:t>Function</w:t>
-      </w:r>
-      <w:proofErr w:type="spellEnd"/>
-      <w:r>
-        <w:t xml:space="preserve"> 2)</w:t>
+        <w:t xml:space="preserve">Based </w:t>
+      </w:r>
+      <w:r>
+        <w:t>Key Derivation Function 2)</w:t>
       </w:r>
       <w:r>
         <w:t xml:space="preserve"> para senhas, token de </w:t>
@@ -985,26 +866,10 @@
         <w:t xml:space="preserve"> assinado com HMAC</w:t>
       </w:r>
       <w:r>
-        <w:t xml:space="preserve"> (Código de Autenticação de Mensagens Baseado em </w:t>
-      </w:r>
-      <w:proofErr w:type="spellStart"/>
-      <w:r>
-        <w:t>Hash</w:t>
-      </w:r>
-      <w:proofErr w:type="spellEnd"/>
-      <w:r>
-        <w:t>)</w:t>
-      </w:r>
-      <w:r>
-        <w:t>, cookie HTTP-</w:t>
-      </w:r>
-      <w:proofErr w:type="spellStart"/>
-      <w:r>
-        <w:t>only</w:t>
-      </w:r>
-      <w:proofErr w:type="spellEnd"/>
-      <w:r>
-        <w:t xml:space="preserve">, bloqueio de </w:t>
+        <w:t xml:space="preserve"> (Código de Autenticação de Mensagens Baseado em Hash)</w:t>
+      </w:r>
+      <w:r>
+        <w:t xml:space="preserve">, cookie HTTP-only, bloqueio de </w:t>
       </w:r>
       <w:r>
         <w:t>sessão</w:t>
@@ -1044,15 +909,7 @@
     </w:p>
     <w:p>
       <w:r>
-        <w:t xml:space="preserve">Executar </w:t>
-      </w:r>
-      <w:proofErr w:type="spellStart"/>
-      <w:r>
-        <w:t>python</w:t>
-      </w:r>
-      <w:proofErr w:type="spellEnd"/>
-      <w:r>
-        <w:t xml:space="preserve"> seed.py cria </w:t>
+        <w:t xml:space="preserve">Executar python seed.py cria </w:t>
       </w:r>
       <w:r>
         <w:t xml:space="preserve">o banco </w:t>
@@ -1067,15 +924,7 @@
         <w:t>demonstração</w:t>
       </w:r>
       <w:r>
-        <w:t xml:space="preserve">. Executar </w:t>
-      </w:r>
-      <w:proofErr w:type="spellStart"/>
-      <w:r>
-        <w:t>python</w:t>
-      </w:r>
-      <w:proofErr w:type="spellEnd"/>
-      <w:r>
-        <w:t xml:space="preserve"> app.py inicia o servidor em http://localhost:8000.</w:t>
+        <w:t>. Executar python app.py inicia o servidor em http://localhost:8000.</w:t>
       </w:r>
     </w:p>
     <w:sectPr>

</xml_diff>